<commit_message>
Add new version of documentation
</commit_message>
<xml_diff>
--- a/Graduation Project Documentation.docx
+++ b/Graduation Project Documentation.docx
@@ -1053,6 +1053,376 @@
       <w:pPr>
         <w:numPr>
           <w:ilvl w:val="0"/>
+          <w:numId w:val="4"/>
+        </w:numPr>
+        <w:spacing w:after="0" w:afterAutospacing="0" w:before="240" w:lineRule="auto"/>
+        <w:ind w:left="720" w:hanging="360"/>
+        <w:rPr>
+          <w:color w:val="1a1a2e"/>
+          <w:sz w:val="24"/>
+          <w:szCs w:val="24"/>
+        </w:rPr>
+      </w:pPr>
+      <w:r>
+        <w:rPr>
+          <w:color w:val="1a1a2e"/>
+          <w:sz w:val="24"/>
+          <w:szCs w:val="24"/>
+          <w:rtl w:val="0"/>
+        </w:rPr>
+        <w:t xml:space="preserve">No separated month or season to detect seasonal trends</w:t>
+      </w:r>
+    </w:p>
+    <w:p>
+      <w:pPr>
+        <w:numPr>
+          <w:ilvl w:val="0"/>
+          <w:numId w:val="4"/>
+        </w:numPr>
+        <w:spacing w:after="240" w:before="0" w:beforeAutospacing="0" w:lineRule="auto"/>
+        <w:ind w:left="720" w:hanging="360"/>
+        <w:rPr>
+          <w:color w:val="1a1a2e"/>
+          <w:sz w:val="24"/>
+          <w:szCs w:val="24"/>
+        </w:rPr>
+      </w:pPr>
+      <w:r>
+        <w:rPr>
+          <w:color w:val="1a1a2e"/>
+          <w:sz w:val="24"/>
+          <w:szCs w:val="24"/>
+          <w:rtl w:val="0"/>
+        </w:rPr>
+        <w:t xml:space="preserve">No time slot classification (Morning, Afternoon, Evening)</w:t>
+      </w:r>
+    </w:p>
+    <w:p>
+      <w:pPr>
+        <w:rPr>
+          <w:color w:val="1a1a2e"/>
+          <w:sz w:val="28"/>
+          <w:szCs w:val="28"/>
+        </w:rPr>
+      </w:pPr>
+      <w:r>
+        <w:rPr>
+          <w:rtl w:val="0"/>
+        </w:rPr>
+      </w:r>
+    </w:p>
+    <w:p>
+      <w:pPr>
+        <w:spacing w:after="240" w:before="240" w:lineRule="auto"/>
+        <w:rPr>
+          <w:color w:val="1a1a2e"/>
+          <w:sz w:val="28"/>
+          <w:szCs w:val="28"/>
+        </w:rPr>
+      </w:pPr>
+      <w:r>
+        <w:rPr>
+          <w:rFonts w:ascii="Arial Unicode MS" w:cs="Arial Unicode MS" w:eastAsia="Arial Unicode MS" w:hAnsi="Arial Unicode MS"/>
+          <w:b w:val="1"/>
+          <w:bCs w:val="1"/>
+          <w:color w:val="1a1a2e"/>
+          <w:sz w:val="28"/>
+          <w:szCs w:val="28"/>
+          <w:rtl w:val="0"/>
+        </w:rPr>
+        <w:t xml:space="preserve">→Problem 3.</w:t>
+      </w:r>
+      <w:r>
+        <w:rPr>
+          <w:color w:val="1a1a2e"/>
+          <w:sz w:val="28"/>
+          <w:szCs w:val="28"/>
+          <w:rtl w:val="0"/>
+        </w:rPr>
+        <w:t xml:space="preserve">  No Customer Spending Comparison </w:t>
+      </w:r>
+    </w:p>
+    <w:p>
+      <w:pPr>
+        <w:spacing w:after="240" w:before="240" w:lineRule="auto"/>
+        <w:rPr>
+          <w:color w:val="1a1a2e"/>
+          <w:sz w:val="24"/>
+          <w:szCs w:val="24"/>
+        </w:rPr>
+      </w:pPr>
+      <w:r>
+        <w:rPr>
+          <w:color w:val="1a1a2e"/>
+          <w:sz w:val="24"/>
+          <w:szCs w:val="24"/>
+          <w:rtl w:val="0"/>
+        </w:rPr>
+        <w:t xml:space="preserve">The data provides no way to compare customer spending behavior, making it impossible to prioritize, segment, or reward high-value customers appropriately.</w:t>
+      </w:r>
+    </w:p>
+    <w:p>
+      <w:pPr>
+        <w:numPr>
+          <w:ilvl w:val="0"/>
+          <w:numId w:val="2"/>
+        </w:numPr>
+        <w:spacing w:after="0" w:afterAutospacing="0" w:before="240" w:lineRule="auto"/>
+        <w:ind w:left="720" w:hanging="360"/>
+        <w:rPr>
+          <w:color w:val="1a1a2e"/>
+          <w:sz w:val="24"/>
+          <w:szCs w:val="24"/>
+        </w:rPr>
+      </w:pPr>
+      <w:r>
+        <w:rPr>
+          <w:color w:val="1a1a2e"/>
+          <w:sz w:val="24"/>
+          <w:szCs w:val="24"/>
+          <w:rtl w:val="0"/>
+        </w:rPr>
+        <w:t xml:space="preserve">No way to classify loyal customers from new buyers </w:t>
+      </w:r>
+    </w:p>
+    <w:p>
+      <w:pPr>
+        <w:numPr>
+          <w:ilvl w:val="0"/>
+          <w:numId w:val="2"/>
+        </w:numPr>
+        <w:spacing w:after="0" w:afterAutospacing="0" w:before="0" w:beforeAutospacing="0" w:lineRule="auto"/>
+        <w:ind w:left="720" w:hanging="360"/>
+        <w:rPr>
+          <w:color w:val="1a1a2e"/>
+          <w:sz w:val="24"/>
+          <w:szCs w:val="24"/>
+        </w:rPr>
+      </w:pPr>
+      <w:r>
+        <w:rPr>
+          <w:color w:val="1a1a2e"/>
+          <w:sz w:val="24"/>
+          <w:szCs w:val="24"/>
+          <w:rtl w:val="0"/>
+        </w:rPr>
+        <w:t xml:space="preserve">A customer who placed a single £10 order appears identical to one who spent over £16,000</w:t>
+      </w:r>
+    </w:p>
+    <w:p>
+      <w:pPr>
+        <w:numPr>
+          <w:ilvl w:val="0"/>
+          <w:numId w:val="2"/>
+        </w:numPr>
+        <w:spacing w:after="240" w:before="0" w:beforeAutospacing="0" w:lineRule="auto"/>
+        <w:ind w:left="720" w:hanging="360"/>
+        <w:rPr>
+          <w:color w:val="1a1a2e"/>
+          <w:sz w:val="24"/>
+          <w:szCs w:val="24"/>
+        </w:rPr>
+      </w:pPr>
+      <w:r>
+        <w:rPr>
+          <w:color w:val="1a1a2e"/>
+          <w:sz w:val="24"/>
+          <w:szCs w:val="24"/>
+          <w:rtl w:val="0"/>
+        </w:rPr>
+        <w:t xml:space="preserve">No metric exists to measure or rank customers by their spending level</w:t>
+      </w:r>
+    </w:p>
+    <w:p>
+      <w:pPr>
+        <w:spacing w:after="240" w:before="240" w:lineRule="auto"/>
+        <w:rPr>
+          <w:color w:val="1a1a2e"/>
+          <w:sz w:val="24"/>
+          <w:szCs w:val="24"/>
+        </w:rPr>
+      </w:pPr>
+      <w:r>
+        <w:rPr>
+          <w:rtl w:val="0"/>
+        </w:rPr>
+      </w:r>
+    </w:p>
+    <w:p>
+      <w:pPr>
+        <w:spacing w:after="240" w:before="240" w:lineRule="auto"/>
+        <w:rPr>
+          <w:color w:val="1a1a2e"/>
+          <w:sz w:val="24"/>
+          <w:szCs w:val="24"/>
+        </w:rPr>
+      </w:pPr>
+      <w:r>
+        <w:rPr>
+          <w:rtl w:val="0"/>
+        </w:rPr>
+      </w:r>
+    </w:p>
+    <w:p>
+      <w:pPr>
+        <w:spacing w:after="240" w:before="240" w:lineRule="auto"/>
+        <w:rPr>
+          <w:color w:val="1a1a2e"/>
+          <w:sz w:val="24"/>
+          <w:szCs w:val="24"/>
+        </w:rPr>
+      </w:pPr>
+      <w:r>
+        <w:rPr>
+          <w:rtl w:val="0"/>
+        </w:rPr>
+      </w:r>
+    </w:p>
+    <w:p>
+      <w:pPr>
+        <w:spacing w:after="240" w:before="240" w:lineRule="auto"/>
+        <w:rPr>
+          <w:b w:val="1"/>
+          <w:bCs w:val="1"/>
+          <w:color w:val="1a1a2e"/>
+          <w:sz w:val="24"/>
+          <w:szCs w:val="24"/>
+        </w:rPr>
+      </w:pPr>
+      <w:r>
+        <w:rPr>
+          <w:b w:val="1"/>
+          <w:bCs w:val="1"/>
+          <w:color w:val="1a1a2e"/>
+          <w:sz w:val="24"/>
+          <w:szCs w:val="24"/>
+          <w:rtl w:val="0"/>
+        </w:rPr>
+        <w:t xml:space="preserve">2.2 Key Questions the Dashboard Will Answer</w:t>
+      </w:r>
+    </w:p>
+    <w:p>
+      <w:pPr>
+        <w:spacing w:after="240" w:before="240" w:lineRule="auto"/>
+        <w:rPr>
+          <w:b w:val="1"/>
+          <w:bCs w:val="1"/>
+          <w:color w:val="1a1a2e"/>
+          <w:sz w:val="24"/>
+          <w:szCs w:val="24"/>
+        </w:rPr>
+      </w:pPr>
+      <w:r>
+        <w:rPr>
+          <w:b w:val="1"/>
+          <w:bCs w:val="1"/>
+          <w:color w:val="1a1a2e"/>
+          <w:sz w:val="24"/>
+          <w:szCs w:val="24"/>
+          <w:rtl w:val="0"/>
+        </w:rPr>
+        <w:t xml:space="preserve">Sales &amp; Revenue:</w:t>
+      </w:r>
+    </w:p>
+    <w:p>
+      <w:pPr>
+        <w:numPr>
+          <w:ilvl w:val="0"/>
+          <w:numId w:val="10"/>
+        </w:numPr>
+        <w:spacing w:after="0" w:afterAutospacing="0" w:before="240" w:lineRule="auto"/>
+        <w:ind w:left="720" w:hanging="360"/>
+        <w:rPr>
+          <w:color w:val="1a1a2e"/>
+          <w:sz w:val="24"/>
+          <w:szCs w:val="24"/>
+        </w:rPr>
+      </w:pPr>
+      <w:r>
+        <w:rPr>
+          <w:color w:val="1a1a2e"/>
+          <w:sz w:val="24"/>
+          <w:szCs w:val="24"/>
+          <w:rtl w:val="0"/>
+        </w:rPr>
+        <w:t xml:space="preserve">What is the total revenue generated across 2009–2010?</w:t>
+      </w:r>
+    </w:p>
+    <w:p>
+      <w:pPr>
+        <w:numPr>
+          <w:ilvl w:val="0"/>
+          <w:numId w:val="10"/>
+        </w:numPr>
+        <w:spacing w:after="0" w:afterAutospacing="0" w:before="0" w:beforeAutospacing="0" w:lineRule="auto"/>
+        <w:ind w:left="720" w:hanging="360"/>
+        <w:rPr>
+          <w:color w:val="1a1a2e"/>
+          <w:sz w:val="24"/>
+          <w:szCs w:val="24"/>
+        </w:rPr>
+      </w:pPr>
+      <w:r>
+        <w:rPr>
+          <w:color w:val="1a1a2e"/>
+          <w:sz w:val="24"/>
+          <w:szCs w:val="24"/>
+          <w:rtl w:val="0"/>
+        </w:rPr>
+        <w:t xml:space="preserve">Which month and quarter recorded the highest sales?</w:t>
+      </w:r>
+    </w:p>
+    <w:p>
+      <w:pPr>
+        <w:numPr>
+          <w:ilvl w:val="0"/>
+          <w:numId w:val="10"/>
+        </w:numPr>
+        <w:spacing w:after="240" w:before="0" w:beforeAutospacing="0" w:lineRule="auto"/>
+        <w:ind w:left="720" w:hanging="360"/>
+        <w:rPr>
+          <w:color w:val="1a1a2e"/>
+          <w:sz w:val="24"/>
+          <w:szCs w:val="24"/>
+        </w:rPr>
+      </w:pPr>
+      <w:r>
+        <w:rPr>
+          <w:color w:val="1a1a2e"/>
+          <w:sz w:val="24"/>
+          <w:szCs w:val="24"/>
+          <w:rtl w:val="0"/>
+        </w:rPr>
+        <w:t xml:space="preserve">Which season (Winter, Spring, Summer, Autumn) generates the most revenue?</w:t>
+      </w:r>
+    </w:p>
+    <w:p>
+      <w:pPr>
+        <w:spacing w:after="240" w:before="240" w:lineRule="auto"/>
+        <w:rPr>
+          <w:b w:val="1"/>
+          <w:bCs w:val="1"/>
+          <w:color w:val="1a1a2e"/>
+          <w:sz w:val="24"/>
+          <w:szCs w:val="24"/>
+        </w:rPr>
+      </w:pPr>
+      <w:r>
+        <w:rPr>
+          <w:b w:val="1"/>
+          <w:bCs w:val="1"/>
+          <w:color w:val="1a1a2e"/>
+          <w:sz w:val="24"/>
+          <w:szCs w:val="24"/>
+          <w:rtl w:val="0"/>
+        </w:rPr>
+        <w:t xml:space="preserve">Time &amp; Behavior:</w:t>
+      </w:r>
+    </w:p>
+    <w:p>
+      <w:pPr>
+        <w:numPr>
+          <w:ilvl w:val="0"/>
           <w:numId w:val="3"/>
         </w:numPr>
         <w:spacing w:after="0" w:afterAutospacing="0" w:before="240" w:lineRule="auto"/>
@@ -1070,7 +1440,7 @@
           <w:szCs w:val="24"/>
           <w:rtl w:val="0"/>
         </w:rPr>
-        <w:t xml:space="preserve">No separated month or season to detect seasonal trends</w:t>
+        <w:t xml:space="preserve">At what time of day (Morning, Afternoon, Evening) do most transactions occur?</w:t>
       </w:r>
     </w:p>
     <w:p>
@@ -1094,78 +1464,37 @@
           <w:szCs w:val="24"/>
           <w:rtl w:val="0"/>
         </w:rPr>
-        <w:t xml:space="preserve">No time slot classification (Morning, Afternoon, Evening)</w:t>
-      </w:r>
-    </w:p>
-    <w:p>
-      <w:pPr>
-        <w:rPr>
-          <w:color w:val="1a1a2e"/>
-          <w:sz w:val="28"/>
-          <w:szCs w:val="28"/>
-        </w:rPr>
-      </w:pPr>
-      <w:r>
-        <w:rPr>
-          <w:rtl w:val="0"/>
-        </w:rPr>
+        <w:t xml:space="preserve">Which hours are the busiest for placing orders?</w:t>
       </w:r>
     </w:p>
     <w:p>
       <w:pPr>
         <w:spacing w:after="240" w:before="240" w:lineRule="auto"/>
         <w:rPr>
-          <w:color w:val="1a1a2e"/>
-          <w:sz w:val="28"/>
-          <w:szCs w:val="28"/>
-        </w:rPr>
-      </w:pPr>
-      <w:r>
-        <w:rPr>
-          <w:rFonts w:ascii="Arial Unicode MS" w:cs="Arial Unicode MS" w:eastAsia="Arial Unicode MS" w:hAnsi="Arial Unicode MS"/>
           <w:b w:val="1"/>
           <w:bCs w:val="1"/>
           <w:color w:val="1a1a2e"/>
-          <w:sz w:val="28"/>
-          <w:szCs w:val="28"/>
-          <w:rtl w:val="0"/>
-        </w:rPr>
-        <w:t xml:space="preserve">→Problem 3.</w:t>
-      </w:r>
-      <w:r>
-        <w:rPr>
-          <w:color w:val="1a1a2e"/>
-          <w:sz w:val="28"/>
-          <w:szCs w:val="28"/>
-          <w:rtl w:val="0"/>
-        </w:rPr>
-        <w:t xml:space="preserve">  No Customer Spending Comparison </w:t>
-      </w:r>
-    </w:p>
-    <w:p>
-      <w:pPr>
-        <w:spacing w:after="240" w:before="240" w:lineRule="auto"/>
-        <w:rPr>
-          <w:color w:val="1a1a2e"/>
-          <w:sz w:val="24"/>
-          <w:szCs w:val="24"/>
-        </w:rPr>
-      </w:pPr>
-      <w:r>
-        <w:rPr>
-          <w:color w:val="1a1a2e"/>
-          <w:sz w:val="24"/>
-          <w:szCs w:val="24"/>
-          <w:rtl w:val="0"/>
-        </w:rPr>
-        <w:t xml:space="preserve">The data provides no way to compare customer spending behavior, making it impossible to prioritize, segment, or reward high-value customers appropriately.</w:t>
+          <w:sz w:val="24"/>
+          <w:szCs w:val="24"/>
+        </w:rPr>
+      </w:pPr>
+      <w:r>
+        <w:rPr>
+          <w:b w:val="1"/>
+          <w:bCs w:val="1"/>
+          <w:color w:val="1a1a2e"/>
+          <w:sz w:val="24"/>
+          <w:szCs w:val="24"/>
+          <w:rtl w:val="0"/>
+        </w:rPr>
+        <w:t xml:space="preserve">Customer Analysis:</w:t>
       </w:r>
     </w:p>
     <w:p>
       <w:pPr>
         <w:numPr>
           <w:ilvl w:val="0"/>
-          <w:numId w:val="2"/>
+          <w:numId w:val="6"/>
         </w:numPr>
         <w:spacing w:after="0" w:afterAutospacing="0" w:before="240" w:lineRule="auto"/>
         <w:ind w:left="720" w:hanging="360"/>
@@ -1182,14 +1511,14 @@
           <w:szCs w:val="24"/>
           <w:rtl w:val="0"/>
         </w:rPr>
-        <w:t xml:space="preserve">No way to classify loyal customers from new buyers </w:t>
+        <w:t xml:space="preserve">Who are the top customers by total revenue?</w:t>
       </w:r>
     </w:p>
     <w:p>
       <w:pPr>
         <w:numPr>
           <w:ilvl w:val="0"/>
-          <w:numId w:val="2"/>
+          <w:numId w:val="6"/>
         </w:numPr>
         <w:spacing w:after="0" w:afterAutospacing="0" w:before="0" w:beforeAutospacing="0" w:lineRule="auto"/>
         <w:ind w:left="720" w:hanging="360"/>
@@ -1206,14 +1535,14 @@
           <w:szCs w:val="24"/>
           <w:rtl w:val="0"/>
         </w:rPr>
-        <w:t xml:space="preserve">A customer who placed a single £10 order appears identical to one who spent over £16,000</w:t>
+        <w:t xml:space="preserve">What is the average order value per customer segment (VIP vs Medium)?</w:t>
       </w:r>
     </w:p>
     <w:p>
       <w:pPr>
         <w:numPr>
           <w:ilvl w:val="0"/>
-          <w:numId w:val="2"/>
+          <w:numId w:val="6"/>
         </w:numPr>
         <w:spacing w:after="240" w:before="0" w:beforeAutospacing="0" w:lineRule="auto"/>
         <w:ind w:left="720" w:hanging="360"/>
@@ -1230,102 +1559,101 @@
           <w:szCs w:val="24"/>
           <w:rtl w:val="0"/>
         </w:rPr>
-        <w:t xml:space="preserve">No metric exists to measure or rank customers by their spending level</w:t>
+        <w:t xml:space="preserve">How many orders does each customer segment perform on average?</w:t>
       </w:r>
     </w:p>
     <w:p>
       <w:pPr>
         <w:spacing w:after="240" w:before="240" w:lineRule="auto"/>
-        <w:rPr>
-          <w:color w:val="1a1a2e"/>
-          <w:sz w:val="28"/>
-          <w:szCs w:val="28"/>
-        </w:rPr>
-      </w:pPr>
-      <w:r>
-        <w:rPr>
-          <w:rtl w:val="0"/>
-        </w:rPr>
-      </w:r>
-    </w:p>
-    <w:p>
-      <w:pPr>
-        <w:pStyle w:val="Heading2"/>
-        <w:keepNext w:val="0"/>
-        <w:keepLines w:val="0"/>
-        <w:spacing w:after="80" w:lineRule="auto"/>
         <w:rPr>
           <w:b w:val="1"/>
           <w:bCs w:val="1"/>
           <w:color w:val="1a1a2e"/>
-          <w:sz w:val="30"/>
-          <w:szCs w:val="30"/>
-        </w:rPr>
-      </w:pPr>
-      <w:bookmarkStart w:colFirst="0" w:colLast="0" w:name="_jhihsobrrsg5" w:id="1"/>
-      <w:bookmarkEnd w:id="1"/>
-      <w:r>
-        <w:rPr>
-          <w:rtl w:val="0"/>
-        </w:rPr>
-      </w:r>
-    </w:p>
-    <w:p>
-      <w:pPr>
-        <w:pStyle w:val="Heading2"/>
-        <w:keepNext w:val="0"/>
-        <w:keepLines w:val="0"/>
-        <w:spacing w:after="80" w:lineRule="auto"/>
+          <w:sz w:val="24"/>
+          <w:szCs w:val="24"/>
+        </w:rPr>
+      </w:pPr>
+      <w:r>
         <w:rPr>
           <w:b w:val="1"/>
           <w:bCs w:val="1"/>
           <w:color w:val="1a1a2e"/>
-          <w:sz w:val="30"/>
-          <w:szCs w:val="30"/>
-        </w:rPr>
-      </w:pPr>
-      <w:bookmarkStart w:colFirst="0" w:colLast="0" w:name="_6k1kiikj7d8f" w:id="2"/>
-      <w:bookmarkEnd w:id="2"/>
-      <w:r>
+          <w:sz w:val="24"/>
+          <w:szCs w:val="24"/>
+          <w:rtl w:val="0"/>
+        </w:rPr>
+        <w:t xml:space="preserve">Product Performance:</w:t>
+      </w:r>
+    </w:p>
+    <w:p>
+      <w:pPr>
+        <w:numPr>
+          <w:ilvl w:val="0"/>
+          <w:numId w:val="7"/>
+        </w:numPr>
+        <w:spacing w:after="0" w:afterAutospacing="0" w:before="240" w:lineRule="auto"/>
+        <w:ind w:left="720" w:hanging="360"/>
+        <w:rPr>
+          <w:color w:val="1a1a2e"/>
+          <w:sz w:val="24"/>
+          <w:szCs w:val="24"/>
+        </w:rPr>
+      </w:pPr>
+      <w:r>
+        <w:rPr>
+          <w:color w:val="1a1a2e"/>
+          <w:sz w:val="24"/>
+          <w:szCs w:val="24"/>
+          <w:rtl w:val="0"/>
+        </w:rPr>
+        <w:t xml:space="preserve">What are the top 10 best-selling products by quantity?</w:t>
+      </w:r>
+    </w:p>
+    <w:p>
+      <w:pPr>
+        <w:numPr>
+          <w:ilvl w:val="0"/>
+          <w:numId w:val="7"/>
+        </w:numPr>
+        <w:spacing w:after="240" w:before="0" w:beforeAutospacing="0" w:lineRule="auto"/>
+        <w:ind w:left="720" w:hanging="360"/>
+        <w:rPr>
+          <w:color w:val="1a1a2e"/>
+          <w:sz w:val="24"/>
+          <w:szCs w:val="24"/>
+        </w:rPr>
+      </w:pPr>
+      <w:r>
+        <w:rPr>
+          <w:color w:val="1a1a2e"/>
+          <w:sz w:val="24"/>
+          <w:szCs w:val="24"/>
+          <w:rtl w:val="0"/>
+        </w:rPr>
+        <w:t xml:space="preserve">Which products generate the highest net sales?</w:t>
+      </w:r>
+    </w:p>
+    <w:p>
+      <w:pPr>
+        <w:spacing w:after="240" w:before="240" w:lineRule="auto"/>
         <w:rPr>
           <w:b w:val="1"/>
           <w:bCs w:val="1"/>
           <w:color w:val="1a1a2e"/>
-          <w:sz w:val="28"/>
-          <w:szCs w:val="28"/>
-          <w:rtl w:val="0"/>
-        </w:rPr>
-        <w:t xml:space="preserve">2.2 Expected Outcomes</w:t>
-      </w:r>
+          <w:sz w:val="24"/>
+          <w:szCs w:val="24"/>
+        </w:rPr>
+      </w:pPr>
       <w:r>
         <w:rPr>
           <w:b w:val="1"/>
           <w:bCs w:val="1"/>
           <w:color w:val="1a1a2e"/>
-          <w:sz w:val="30"/>
-          <w:szCs w:val="30"/>
-          <w:rtl w:val="0"/>
-        </w:rPr>
-        <w:t xml:space="preserve"> </w:t>
-      </w:r>
-    </w:p>
-    <w:p>
-      <w:pPr>
-        <w:spacing w:after="80" w:before="80" w:lineRule="auto"/>
-        <w:rPr>
-          <w:color w:val="1a1a2e"/>
-          <w:sz w:val="24"/>
-          <w:szCs w:val="24"/>
-        </w:rPr>
-      </w:pPr>
-      <w:r>
-        <w:rPr>
-          <w:color w:val="1a1a2e"/>
-          <w:sz w:val="24"/>
-          <w:szCs w:val="24"/>
-          <w:rtl w:val="0"/>
-        </w:rPr>
-        <w:t xml:space="preserve">By the end of this project, a fully interactive dashboard will allow business stakeholders to:</w:t>
+          <w:sz w:val="24"/>
+          <w:szCs w:val="24"/>
+          <w:rtl w:val="0"/>
+        </w:rPr>
+        <w:t xml:space="preserve">Geography:</w:t>
       </w:r>
     </w:p>
     <w:p>
@@ -1349,7 +1677,7 @@
           <w:szCs w:val="24"/>
           <w:rtl w:val="0"/>
         </w:rPr>
-        <w:t xml:space="preserve">Monitor sales performance across months, quarters, and seasons.</w:t>
+        <w:t xml:space="preserve">Which countries contribute the most orders and revenue?</w:t>
       </w:r>
     </w:p>
     <w:p>
@@ -1358,7 +1686,7 @@
           <w:ilvl w:val="0"/>
           <w:numId w:val="5"/>
         </w:numPr>
-        <w:spacing w:after="0" w:afterAutospacing="0" w:before="0" w:beforeAutospacing="0" w:lineRule="auto"/>
+        <w:spacing w:after="240" w:before="0" w:beforeAutospacing="0" w:lineRule="auto"/>
         <w:ind w:left="720" w:hanging="360"/>
         <w:rPr>
           <w:color w:val="1a1a2e"/>
@@ -1373,14 +1701,216 @@
           <w:szCs w:val="24"/>
           <w:rtl w:val="0"/>
         </w:rPr>
-        <w:t xml:space="preserve">Identify high-value customers to target for loyalty and retention programs</w:t>
+        <w:t xml:space="preserve">How does the UK compare to other countries in total sales?</w:t>
+      </w:r>
+    </w:p>
+    <w:p>
+      <w:pPr>
+        <w:spacing w:after="240" w:before="240" w:lineRule="auto"/>
+        <w:rPr>
+          <w:color w:val="1a1a2e"/>
+          <w:sz w:val="24"/>
+          <w:szCs w:val="24"/>
+        </w:rPr>
+      </w:pPr>
+      <w:r>
+        <w:rPr>
+          <w:rtl w:val="0"/>
+        </w:rPr>
+      </w:r>
+    </w:p>
+    <w:p>
+      <w:pPr>
+        <w:spacing w:after="240" w:before="240" w:lineRule="auto"/>
+        <w:rPr>
+          <w:color w:val="1a1a2e"/>
+          <w:sz w:val="24"/>
+          <w:szCs w:val="24"/>
+        </w:rPr>
+      </w:pPr>
+      <w:r>
+        <w:rPr>
+          <w:rtl w:val="0"/>
+        </w:rPr>
+      </w:r>
+    </w:p>
+    <w:p>
+      <w:pPr>
+        <w:spacing w:after="240" w:before="240" w:lineRule="auto"/>
+        <w:rPr>
+          <w:color w:val="1a1a2e"/>
+          <w:sz w:val="24"/>
+          <w:szCs w:val="24"/>
+        </w:rPr>
+      </w:pPr>
+      <w:r>
+        <w:rPr>
+          <w:rtl w:val="0"/>
+        </w:rPr>
+      </w:r>
+    </w:p>
+    <w:p>
+      <w:pPr>
+        <w:spacing w:after="240" w:before="240" w:lineRule="auto"/>
+        <w:rPr>
+          <w:color w:val="1a1a2e"/>
+          <w:sz w:val="24"/>
+          <w:szCs w:val="24"/>
+        </w:rPr>
+      </w:pPr>
+      <w:r>
+        <w:rPr>
+          <w:rtl w:val="0"/>
+        </w:rPr>
+      </w:r>
+    </w:p>
+    <w:p>
+      <w:pPr>
+        <w:spacing w:after="240" w:before="240" w:lineRule="auto"/>
+        <w:rPr>
+          <w:color w:val="1a1a2e"/>
+          <w:sz w:val="24"/>
+          <w:szCs w:val="24"/>
+        </w:rPr>
+      </w:pPr>
+      <w:r>
+        <w:rPr>
+          <w:rtl w:val="0"/>
+        </w:rPr>
+      </w:r>
+    </w:p>
+    <w:p>
+      <w:pPr>
+        <w:spacing w:after="240" w:before="240" w:lineRule="auto"/>
+        <w:rPr>
+          <w:color w:val="1a1a2e"/>
+          <w:sz w:val="24"/>
+          <w:szCs w:val="24"/>
+        </w:rPr>
+      </w:pPr>
+      <w:r>
+        <w:rPr>
+          <w:rtl w:val="0"/>
+        </w:rPr>
+      </w:r>
+    </w:p>
+    <w:p>
+      <w:pPr>
+        <w:spacing w:after="240" w:before="240" w:lineRule="auto"/>
+        <w:rPr>
+          <w:color w:val="1a1a2e"/>
+          <w:sz w:val="24"/>
+          <w:szCs w:val="24"/>
+        </w:rPr>
+      </w:pPr>
+      <w:r>
+        <w:rPr>
+          <w:rtl w:val="0"/>
+        </w:rPr>
+      </w:r>
+    </w:p>
+    <w:p>
+      <w:pPr>
+        <w:spacing w:after="240" w:before="240" w:lineRule="auto"/>
+        <w:rPr>
+          <w:color w:val="1a1a2e"/>
+          <w:sz w:val="24"/>
+          <w:szCs w:val="24"/>
+        </w:rPr>
+      </w:pPr>
+      <w:r>
+        <w:rPr>
+          <w:rtl w:val="0"/>
+        </w:rPr>
+      </w:r>
+    </w:p>
+    <w:p>
+      <w:pPr>
+        <w:pStyle w:val="Heading2"/>
+        <w:keepNext w:val="0"/>
+        <w:keepLines w:val="0"/>
+        <w:spacing w:after="80" w:lineRule="auto"/>
+        <w:rPr>
+          <w:b w:val="1"/>
+          <w:bCs w:val="1"/>
+          <w:color w:val="1a1a2e"/>
+          <w:sz w:val="30"/>
+          <w:szCs w:val="30"/>
+        </w:rPr>
+      </w:pPr>
+      <w:bookmarkStart w:colFirst="0" w:colLast="0" w:name="_6k1kiikj7d8f" w:id="1"/>
+      <w:bookmarkEnd w:id="1"/>
+      <w:r>
+        <w:rPr>
+          <w:b w:val="1"/>
+          <w:bCs w:val="1"/>
+          <w:color w:val="1a1a2e"/>
+          <w:sz w:val="28"/>
+          <w:szCs w:val="28"/>
+          <w:rtl w:val="0"/>
+        </w:rPr>
+        <w:t xml:space="preserve">2.3 Expected Outcomes</w:t>
+      </w:r>
+      <w:r>
+        <w:rPr>
+          <w:b w:val="1"/>
+          <w:bCs w:val="1"/>
+          <w:color w:val="1a1a2e"/>
+          <w:sz w:val="30"/>
+          <w:szCs w:val="30"/>
+          <w:rtl w:val="0"/>
+        </w:rPr>
+        <w:t xml:space="preserve"> </w:t>
+      </w:r>
+    </w:p>
+    <w:p>
+      <w:pPr>
+        <w:spacing w:after="80" w:before="80" w:lineRule="auto"/>
+        <w:rPr>
+          <w:color w:val="1a1a2e"/>
+          <w:sz w:val="24"/>
+          <w:szCs w:val="24"/>
+        </w:rPr>
+      </w:pPr>
+      <w:r>
+        <w:rPr>
+          <w:color w:val="1a1a2e"/>
+          <w:sz w:val="24"/>
+          <w:szCs w:val="24"/>
+          <w:rtl w:val="0"/>
+        </w:rPr>
+        <w:t xml:space="preserve">By the end of this project, a fully interactive dashboard will allow business stakeholders to:</w:t>
       </w:r>
     </w:p>
     <w:p>
       <w:pPr>
         <w:numPr>
           <w:ilvl w:val="0"/>
-          <w:numId w:val="5"/>
+          <w:numId w:val="9"/>
+        </w:numPr>
+        <w:spacing w:after="0" w:afterAutospacing="0" w:before="240" w:lineRule="auto"/>
+        <w:ind w:left="720" w:hanging="360"/>
+        <w:rPr>
+          <w:color w:val="1a1a2e"/>
+          <w:sz w:val="24"/>
+          <w:szCs w:val="24"/>
+        </w:rPr>
+      </w:pPr>
+      <w:r>
+        <w:rPr>
+          <w:color w:val="1a1a2e"/>
+          <w:sz w:val="24"/>
+          <w:szCs w:val="24"/>
+          <w:rtl w:val="0"/>
+        </w:rPr>
+        <w:t xml:space="preserve">Monitor sales performance across months, quarters, and seasons.</w:t>
+      </w:r>
+    </w:p>
+    <w:p>
+      <w:pPr>
+        <w:numPr>
+          <w:ilvl w:val="0"/>
+          <w:numId w:val="9"/>
         </w:numPr>
         <w:spacing w:after="0" w:afterAutospacing="0" w:before="0" w:beforeAutospacing="0" w:lineRule="auto"/>
         <w:ind w:left="720" w:hanging="360"/>
@@ -1397,14 +1927,14 @@
           <w:szCs w:val="24"/>
           <w:rtl w:val="0"/>
         </w:rPr>
-        <w:t xml:space="preserve">Detect seasonal demand patterns to optimize inventory and marketing campaigns</w:t>
+        <w:t xml:space="preserve">Identify high-value customers to target for loyalty and retention programs</w:t>
       </w:r>
     </w:p>
     <w:p>
       <w:pPr>
         <w:numPr>
           <w:ilvl w:val="0"/>
-          <w:numId w:val="5"/>
+          <w:numId w:val="9"/>
         </w:numPr>
         <w:spacing w:after="0" w:afterAutospacing="0" w:before="0" w:beforeAutospacing="0" w:lineRule="auto"/>
         <w:ind w:left="720" w:hanging="360"/>
@@ -1421,14 +1951,14 @@
           <w:szCs w:val="24"/>
           <w:rtl w:val="0"/>
         </w:rPr>
-        <w:t xml:space="preserve">Compare product performance to make smarter stocking and pricing decisions</w:t>
+        <w:t xml:space="preserve">Detect seasonal demand patterns to optimize inventory and marketing campaigns</w:t>
       </w:r>
     </w:p>
     <w:p>
       <w:pPr>
         <w:numPr>
           <w:ilvl w:val="0"/>
-          <w:numId w:val="5"/>
+          <w:numId w:val="9"/>
         </w:numPr>
         <w:spacing w:after="0" w:afterAutospacing="0" w:before="0" w:beforeAutospacing="0" w:lineRule="auto"/>
         <w:ind w:left="720" w:hanging="360"/>
@@ -1445,14 +1975,38 @@
           <w:szCs w:val="24"/>
           <w:rtl w:val="0"/>
         </w:rPr>
-        <w:t xml:space="preserve">Understand geographic market contribution beyond the UK</w:t>
+        <w:t xml:space="preserve">Compare product performance to make smarter stocking and pricing decisions</w:t>
       </w:r>
     </w:p>
     <w:p>
       <w:pPr>
         <w:numPr>
           <w:ilvl w:val="0"/>
-          <w:numId w:val="5"/>
+          <w:numId w:val="9"/>
+        </w:numPr>
+        <w:spacing w:after="0" w:afterAutospacing="0" w:before="0" w:beforeAutospacing="0" w:lineRule="auto"/>
+        <w:ind w:left="720" w:hanging="360"/>
+        <w:rPr>
+          <w:color w:val="1a1a2e"/>
+          <w:sz w:val="24"/>
+          <w:szCs w:val="24"/>
+        </w:rPr>
+      </w:pPr>
+      <w:r>
+        <w:rPr>
+          <w:color w:val="1a1a2e"/>
+          <w:sz w:val="24"/>
+          <w:szCs w:val="24"/>
+          <w:rtl w:val="0"/>
+        </w:rPr>
+        <w:t xml:space="preserve">Understand geographic market contribution beyond the UK</w:t>
+      </w:r>
+    </w:p>
+    <w:p>
+      <w:pPr>
+        <w:numPr>
+          <w:ilvl w:val="0"/>
+          <w:numId w:val="9"/>
         </w:numPr>
         <w:spacing w:after="240" w:before="0" w:beforeAutospacing="0" w:lineRule="auto"/>
         <w:ind w:left="720" w:hanging="360"/>
@@ -1518,8 +2072,8 @@
           <w:szCs w:val="32"/>
         </w:rPr>
       </w:pPr>
-      <w:bookmarkStart w:colFirst="0" w:colLast="0" w:name="_dz8z0l5cx8gu" w:id="3"/>
-      <w:bookmarkEnd w:id="3"/>
+      <w:bookmarkStart w:colFirst="0" w:colLast="0" w:name="_dz8z0l5cx8gu" w:id="2"/>
+      <w:bookmarkEnd w:id="2"/>
       <w:r>
         <w:rPr>
           <w:b w:val="1"/>
@@ -1540,7 +2094,7 @@
         <w:keepLines w:val="0"/>
         <w:numPr>
           <w:ilvl w:val="0"/>
-          <w:numId w:val="4"/>
+          <w:numId w:val="8"/>
         </w:numPr>
         <w:pBdr>
           <w:top w:color="auto" w:space="0" w:sz="0" w:val="none"/>
@@ -1553,8 +2107,8 @@
         <w:ind w:left="720" w:hanging="360"/>
         <w:rPr/>
       </w:pPr>
-      <w:bookmarkStart w:colFirst="0" w:colLast="0" w:name="_sv7lladzs82f" w:id="4"/>
-      <w:bookmarkEnd w:id="4"/>
+      <w:bookmarkStart w:colFirst="0" w:colLast="0" w:name="_sv7lladzs82f" w:id="3"/>
+      <w:bookmarkEnd w:id="3"/>
       <w:r>
         <w:rPr>
           <w:b w:val="1"/>
@@ -1582,7 +2136,53 @@
         <w:keepLines w:val="0"/>
         <w:numPr>
           <w:ilvl w:val="0"/>
-          <w:numId w:val="4"/>
+          <w:numId w:val="8"/>
+        </w:numPr>
+        <w:pBdr>
+          <w:top w:color="auto" w:space="0" w:sz="0" w:val="none"/>
+          <w:left w:color="auto" w:space="0" w:sz="0" w:val="none"/>
+          <w:bottom w:color="auto" w:space="0" w:sz="0" w:val="none"/>
+          <w:right w:color="auto" w:space="0" w:sz="0" w:val="none"/>
+          <w:between w:color="auto" w:space="0" w:sz="0" w:val="none"/>
+        </w:pBdr>
+        <w:spacing w:after="0" w:afterAutospacing="0" w:before="0" w:beforeAutospacing="0" w:lineRule="auto"/>
+        <w:ind w:left="720" w:hanging="360"/>
+      </w:pPr>
+      <w:bookmarkStart w:colFirst="0" w:colLast="0" w:name="_c284m1uan0m6" w:id="4"/>
+      <w:bookmarkEnd w:id="4"/>
+      <w:r>
+        <w:rPr>
+          <w:b w:val="1"/>
+          <w:bCs w:val="1"/>
+          <w:sz w:val="24"/>
+          <w:szCs w:val="24"/>
+          <w:u w:val="single"/>
+          <w:rtl w:val="0"/>
+        </w:rPr>
+        <w:t xml:space="preserve">Python:</w:t>
+      </w:r>
+      <w:r>
+        <w:rPr>
+          <w:sz w:val="24"/>
+          <w:szCs w:val="24"/>
+          <w:rtl w:val="0"/>
+        </w:rPr>
+        <w:t xml:space="preserve"> For Data Exploration</w:t>
+      </w:r>
+      <w:r>
+        <w:rPr>
+          <w:rtl w:val="0"/>
+        </w:rPr>
+      </w:r>
+    </w:p>
+    <w:p>
+      <w:pPr>
+        <w:pStyle w:val="Heading1"/>
+        <w:keepNext w:val="0"/>
+        <w:keepLines w:val="0"/>
+        <w:numPr>
+          <w:ilvl w:val="0"/>
+          <w:numId w:val="8"/>
         </w:numPr>
         <w:pBdr>
           <w:top w:color="auto" w:space="0" w:sz="0" w:val="none"/>
@@ -1616,6 +2216,12 @@
         </w:rPr>
         <w:t xml:space="preserve"> For Data Visualization</w:t>
       </w:r>
+    </w:p>
+    <w:p>
+      <w:pPr>
+        <w:ind w:left="720" w:firstLine="0"/>
+        <w:rPr/>
+      </w:pPr>
       <w:r>
         <w:rPr>
           <w:rtl w:val="0"/>
@@ -5199,10 +5805,760 @@
       </w:pPr>
       <w:r>
         <w:rPr>
+          <w:rtl w:val="0"/>
+        </w:rPr>
+      </w:r>
+    </w:p>
+    <w:p>
+      <w:pPr>
+        <w:spacing w:after="60" w:before="60" w:lineRule="auto"/>
+        <w:rPr>
+          <w:color w:val="1a1a2e"/>
+        </w:rPr>
+      </w:pPr>
+      <w:r>
+        <w:rPr>
+          <w:rtl w:val="0"/>
+        </w:rPr>
+      </w:r>
+    </w:p>
+    <w:p>
+      <w:pPr>
+        <w:spacing w:after="60" w:before="60" w:lineRule="auto"/>
+        <w:rPr>
+          <w:b w:val="1"/>
+          <w:bCs w:val="1"/>
+          <w:i w:val="1"/>
+          <w:iCs w:val="1"/>
+          <w:color w:val="1a1a2e"/>
+          <w:sz w:val="32"/>
+          <w:szCs w:val="32"/>
+        </w:rPr>
+      </w:pPr>
+      <w:r>
+        <w:rPr>
+          <w:b w:val="1"/>
+          <w:bCs w:val="1"/>
+          <w:i w:val="1"/>
+          <w:iCs w:val="1"/>
+          <w:color w:val="1a1a2e"/>
+          <w:sz w:val="32"/>
+          <w:szCs w:val="32"/>
+        </w:rPr>
+        <w:drawing>
+          <wp:anchor allowOverlap="1" behindDoc="0" distB="114300" distT="114300" distL="114300" distR="114300" hidden="0" layoutInCell="1" locked="0" relativeHeight="0" simplePos="0">
+            <wp:simplePos x="0" y="0"/>
+            <wp:positionH relativeFrom="margin">
+              <wp:posOffset>-685799</wp:posOffset>
+            </wp:positionH>
+            <wp:positionV relativeFrom="margin">
+              <wp:posOffset>609600</wp:posOffset>
+            </wp:positionV>
+            <wp:extent cx="7315200" cy="4269648"/>
+            <wp:effectExtent b="0" l="0" r="0" t="0"/>
+            <wp:wrapNone/>
+            <wp:docPr id="4" name="image1.png"/>
+            <a:graphic>
+              <a:graphicData uri="http://schemas.openxmlformats.org/drawingml/2006/picture">
+                <pic:pic>
+                  <pic:nvPicPr>
+                    <pic:cNvPr id="0" name="image1.png"/>
+                    <pic:cNvPicPr preferRelativeResize="0"/>
+                  </pic:nvPicPr>
+                  <pic:blipFill>
+                    <a:blip r:embed="rId6"/>
+                    <a:srcRect b="0" l="0" r="0" t="0"/>
+                    <a:stretch>
+                      <a:fillRect/>
+                    </a:stretch>
+                  </pic:blipFill>
+                  <pic:spPr>
+                    <a:xfrm>
+                      <a:off x="0" y="0"/>
+                      <a:ext cx="7315200" cy="4269648"/>
+                    </a:xfrm>
+                    <a:prstGeom prst="rect"/>
+                    <a:ln/>
+                  </pic:spPr>
+                </pic:pic>
+              </a:graphicData>
+            </a:graphic>
+          </wp:anchor>
+        </w:drawing>
+      </w:r>
+      <w:r>
+        <w:rPr>
+          <w:b w:val="1"/>
+          <w:bCs w:val="1"/>
+          <w:i w:val="1"/>
+          <w:iCs w:val="1"/>
+          <w:color w:val="1a1a2e"/>
+          <w:sz w:val="32"/>
+          <w:szCs w:val="32"/>
+          <w:rtl w:val="0"/>
+        </w:rPr>
+        <w:t xml:space="preserve">6. Data Preprocessing Snapshots</w:t>
+      </w:r>
+    </w:p>
+    <w:p>
+      <w:pPr>
+        <w:spacing w:after="60" w:before="60" w:lineRule="auto"/>
+        <w:rPr>
+          <w:color w:val="1a1a2e"/>
+        </w:rPr>
+      </w:pPr>
+      <w:r>
+        <w:rPr>
           <w:color w:val="1a1a2e"/>
           <w:rtl w:val="0"/>
         </w:rPr>
         <w:t xml:space="preserve"> </w:t>
+      </w:r>
+    </w:p>
+    <w:p>
+      <w:pPr>
+        <w:spacing w:after="80" w:before="60" w:lineRule="auto"/>
+        <w:rPr>
+          <w:sz w:val="28"/>
+          <w:szCs w:val="28"/>
+          <w:u w:val="single"/>
+        </w:rPr>
+      </w:pPr>
+      <w:r>
+        <w:rPr>
+          <w:rtl w:val="0"/>
+        </w:rPr>
+      </w:r>
+    </w:p>
+    <w:p>
+      <w:pPr>
+        <w:spacing w:after="80" w:before="60" w:lineRule="auto"/>
+        <w:rPr>
+          <w:sz w:val="28"/>
+          <w:szCs w:val="28"/>
+          <w:u w:val="single"/>
+        </w:rPr>
+      </w:pPr>
+      <w:r>
+        <w:rPr>
+          <w:rtl w:val="0"/>
+        </w:rPr>
+      </w:r>
+    </w:p>
+    <w:p>
+      <w:pPr>
+        <w:spacing w:after="80" w:before="60" w:lineRule="auto"/>
+        <w:rPr>
+          <w:sz w:val="28"/>
+          <w:szCs w:val="28"/>
+          <w:u w:val="single"/>
+        </w:rPr>
+      </w:pPr>
+      <w:r>
+        <w:rPr>
+          <w:rtl w:val="0"/>
+        </w:rPr>
+      </w:r>
+    </w:p>
+    <w:p>
+      <w:pPr>
+        <w:spacing w:after="80" w:before="60" w:lineRule="auto"/>
+        <w:rPr>
+          <w:sz w:val="28"/>
+          <w:szCs w:val="28"/>
+          <w:u w:val="single"/>
+        </w:rPr>
+      </w:pPr>
+      <w:r>
+        <w:rPr>
+          <w:sz w:val="28"/>
+          <w:szCs w:val="28"/>
+          <w:u w:val="single"/>
+        </w:rPr>
+        <w:drawing>
+          <wp:anchor allowOverlap="1" behindDoc="0" distB="114300" distT="114300" distL="114300" distR="114300" hidden="0" layoutInCell="1" locked="0" relativeHeight="0" simplePos="0">
+            <wp:simplePos x="0" y="0"/>
+            <wp:positionH relativeFrom="page">
+              <wp:posOffset>123825</wp:posOffset>
+            </wp:positionH>
+            <wp:positionV relativeFrom="page">
+              <wp:posOffset>5867507</wp:posOffset>
+            </wp:positionV>
+            <wp:extent cx="7415213" cy="3905250"/>
+            <wp:effectExtent b="0" l="0" r="0" t="0"/>
+            <wp:wrapNone/>
+            <wp:docPr id="1" name="image3.png"/>
+            <a:graphic>
+              <a:graphicData uri="http://schemas.openxmlformats.org/drawingml/2006/picture">
+                <pic:pic>
+                  <pic:nvPicPr>
+                    <pic:cNvPr id="0" name="image3.png"/>
+                    <pic:cNvPicPr preferRelativeResize="0"/>
+                  </pic:nvPicPr>
+                  <pic:blipFill>
+                    <a:blip r:embed="rId7"/>
+                    <a:srcRect b="0" l="0" r="0" t="0"/>
+                    <a:stretch>
+                      <a:fillRect/>
+                    </a:stretch>
+                  </pic:blipFill>
+                  <pic:spPr>
+                    <a:xfrm>
+                      <a:off x="0" y="0"/>
+                      <a:ext cx="7415213" cy="3905250"/>
+                    </a:xfrm>
+                    <a:prstGeom prst="rect"/>
+                    <a:ln/>
+                  </pic:spPr>
+                </pic:pic>
+              </a:graphicData>
+            </a:graphic>
+          </wp:anchor>
+        </w:drawing>
+      </w:r>
+      <w:r>
+        <w:rPr>
+          <w:rtl w:val="0"/>
+        </w:rPr>
+      </w:r>
+    </w:p>
+    <w:p>
+      <w:pPr>
+        <w:spacing w:after="80" w:before="60" w:lineRule="auto"/>
+        <w:rPr>
+          <w:sz w:val="28"/>
+          <w:szCs w:val="28"/>
+          <w:u w:val="single"/>
+        </w:rPr>
+      </w:pPr>
+      <w:r>
+        <w:rPr>
+          <w:rtl w:val="0"/>
+        </w:rPr>
+      </w:r>
+    </w:p>
+    <w:p>
+      <w:pPr>
+        <w:spacing w:after="80" w:before="60" w:lineRule="auto"/>
+        <w:rPr>
+          <w:sz w:val="28"/>
+          <w:szCs w:val="28"/>
+          <w:u w:val="single"/>
+        </w:rPr>
+      </w:pPr>
+      <w:r>
+        <w:rPr>
+          <w:rtl w:val="0"/>
+        </w:rPr>
+      </w:r>
+    </w:p>
+    <w:p>
+      <w:pPr>
+        <w:spacing w:after="80" w:before="60" w:lineRule="auto"/>
+        <w:rPr>
+          <w:sz w:val="28"/>
+          <w:szCs w:val="28"/>
+          <w:u w:val="single"/>
+        </w:rPr>
+      </w:pPr>
+      <w:r>
+        <w:rPr>
+          <w:rtl w:val="0"/>
+        </w:rPr>
+      </w:r>
+    </w:p>
+    <w:p>
+      <w:pPr>
+        <w:spacing w:after="80" w:before="60" w:lineRule="auto"/>
+        <w:rPr>
+          <w:sz w:val="28"/>
+          <w:szCs w:val="28"/>
+          <w:u w:val="single"/>
+        </w:rPr>
+      </w:pPr>
+      <w:r>
+        <w:rPr>
+          <w:rtl w:val="0"/>
+        </w:rPr>
+      </w:r>
+    </w:p>
+    <w:p>
+      <w:pPr>
+        <w:spacing w:after="80" w:before="60" w:lineRule="auto"/>
+        <w:rPr>
+          <w:sz w:val="28"/>
+          <w:szCs w:val="28"/>
+          <w:u w:val="single"/>
+        </w:rPr>
+      </w:pPr>
+      <w:r>
+        <w:rPr>
+          <w:rtl w:val="0"/>
+        </w:rPr>
+      </w:r>
+    </w:p>
+    <w:p>
+      <w:pPr>
+        <w:spacing w:after="80" w:before="60" w:lineRule="auto"/>
+        <w:rPr>
+          <w:sz w:val="28"/>
+          <w:szCs w:val="28"/>
+          <w:u w:val="single"/>
+        </w:rPr>
+      </w:pPr>
+      <w:r>
+        <w:rPr>
+          <w:rtl w:val="0"/>
+        </w:rPr>
+      </w:r>
+    </w:p>
+    <w:p>
+      <w:pPr>
+        <w:spacing w:after="80" w:before="60" w:lineRule="auto"/>
+        <w:rPr>
+          <w:sz w:val="28"/>
+          <w:szCs w:val="28"/>
+          <w:u w:val="single"/>
+        </w:rPr>
+      </w:pPr>
+      <w:r>
+        <w:rPr>
+          <w:rtl w:val="0"/>
+        </w:rPr>
+      </w:r>
+    </w:p>
+    <w:p>
+      <w:pPr>
+        <w:spacing w:after="80" w:before="60" w:lineRule="auto"/>
+        <w:rPr>
+          <w:sz w:val="28"/>
+          <w:szCs w:val="28"/>
+          <w:u w:val="single"/>
+        </w:rPr>
+      </w:pPr>
+      <w:r>
+        <w:rPr>
+          <w:rtl w:val="0"/>
+        </w:rPr>
+      </w:r>
+    </w:p>
+    <w:p>
+      <w:pPr>
+        <w:spacing w:after="80" w:before="60" w:lineRule="auto"/>
+        <w:rPr>
+          <w:sz w:val="28"/>
+          <w:szCs w:val="28"/>
+          <w:u w:val="single"/>
+        </w:rPr>
+      </w:pPr>
+      <w:r>
+        <w:rPr>
+          <w:rtl w:val="0"/>
+        </w:rPr>
+      </w:r>
+    </w:p>
+    <w:p>
+      <w:pPr>
+        <w:spacing w:after="80" w:before="60" w:lineRule="auto"/>
+        <w:rPr>
+          <w:sz w:val="28"/>
+          <w:szCs w:val="28"/>
+          <w:u w:val="single"/>
+        </w:rPr>
+      </w:pPr>
+      <w:r>
+        <w:rPr>
+          <w:rtl w:val="0"/>
+        </w:rPr>
+      </w:r>
+    </w:p>
+    <w:p>
+      <w:pPr>
+        <w:spacing w:after="80" w:before="60" w:lineRule="auto"/>
+        <w:rPr>
+          <w:sz w:val="28"/>
+          <w:szCs w:val="28"/>
+          <w:u w:val="single"/>
+        </w:rPr>
+      </w:pPr>
+      <w:r>
+        <w:rPr>
+          <w:rtl w:val="0"/>
+        </w:rPr>
+      </w:r>
+    </w:p>
+    <w:p>
+      <w:pPr>
+        <w:spacing w:after="80" w:before="60" w:lineRule="auto"/>
+        <w:jc w:val="center"/>
+        <w:rPr>
+          <w:sz w:val="28"/>
+          <w:szCs w:val="28"/>
+          <w:u w:val="single"/>
+        </w:rPr>
+      </w:pPr>
+      <w:r>
+        <w:rPr>
+          <w:sz w:val="28"/>
+          <w:szCs w:val="28"/>
+          <w:u w:val="single"/>
+        </w:rPr>
+        <w:drawing>
+          <wp:anchor allowOverlap="1" behindDoc="0" distB="114300" distT="114300" distL="114300" distR="114300" hidden="0" layoutInCell="1" locked="0" relativeHeight="0" simplePos="0">
+            <wp:simplePos x="0" y="0"/>
+            <wp:positionH relativeFrom="margin">
+              <wp:align>center</wp:align>
+            </wp:positionH>
+            <wp:positionV relativeFrom="margin">
+              <wp:align>top</wp:align>
+            </wp:positionV>
+            <wp:extent cx="7396163" cy="3790950"/>
+            <wp:effectExtent b="0" l="0" r="0" t="0"/>
+            <wp:wrapNone/>
+            <wp:docPr id="5" name="image5.png"/>
+            <a:graphic>
+              <a:graphicData uri="http://schemas.openxmlformats.org/drawingml/2006/picture">
+                <pic:pic>
+                  <pic:nvPicPr>
+                    <pic:cNvPr id="0" name="image5.png"/>
+                    <pic:cNvPicPr preferRelativeResize="0"/>
+                  </pic:nvPicPr>
+                  <pic:blipFill>
+                    <a:blip r:embed="rId8"/>
+                    <a:srcRect b="0" l="0" r="0" t="0"/>
+                    <a:stretch>
+                      <a:fillRect/>
+                    </a:stretch>
+                  </pic:blipFill>
+                  <pic:spPr>
+                    <a:xfrm>
+                      <a:off x="0" y="0"/>
+                      <a:ext cx="7396163" cy="3790950"/>
+                    </a:xfrm>
+                    <a:prstGeom prst="rect"/>
+                    <a:ln/>
+                  </pic:spPr>
+                </pic:pic>
+              </a:graphicData>
+            </a:graphic>
+          </wp:anchor>
+        </w:drawing>
+      </w:r>
+      <w:r>
+        <w:rPr>
+          <w:sz w:val="28"/>
+          <w:szCs w:val="28"/>
+          <w:u w:val="single"/>
+        </w:rPr>
+        <w:drawing>
+          <wp:inline distB="114300" distT="114300" distL="114300" distR="114300">
+            <wp:extent cx="5943600" cy="3175000"/>
+            <wp:effectExtent b="0" l="0" r="0" t="0"/>
+            <wp:docPr id="2" name="image2.png"/>
+            <a:graphic>
+              <a:graphicData uri="http://schemas.openxmlformats.org/drawingml/2006/picture">
+                <pic:pic>
+                  <pic:nvPicPr>
+                    <pic:cNvPr id="0" name="image2.png"/>
+                    <pic:cNvPicPr preferRelativeResize="0"/>
+                  </pic:nvPicPr>
+                  <pic:blipFill>
+                    <a:blip r:embed="rId9"/>
+                    <a:srcRect b="0" l="0" r="0" t="0"/>
+                    <a:stretch>
+                      <a:fillRect/>
+                    </a:stretch>
+                  </pic:blipFill>
+                  <pic:spPr>
+                    <a:xfrm>
+                      <a:off x="0" y="0"/>
+                      <a:ext cx="5943600" cy="3175000"/>
+                    </a:xfrm>
+                    <a:prstGeom prst="rect"/>
+                    <a:ln/>
+                  </pic:spPr>
+                </pic:pic>
+              </a:graphicData>
+            </a:graphic>
+          </wp:inline>
+        </w:drawing>
+      </w:r>
+      <w:r>
+        <w:rPr>
+          <w:rtl w:val="0"/>
+        </w:rPr>
+      </w:r>
+    </w:p>
+    <w:p>
+      <w:pPr>
+        <w:spacing w:after="80" w:before="60" w:lineRule="auto"/>
+        <w:rPr>
+          <w:sz w:val="28"/>
+          <w:szCs w:val="28"/>
+          <w:u w:val="single"/>
+        </w:rPr>
+      </w:pPr>
+      <w:r>
+        <w:rPr>
+          <w:rtl w:val="0"/>
+        </w:rPr>
+      </w:r>
+    </w:p>
+    <w:p>
+      <w:pPr>
+        <w:spacing w:after="80" w:before="60" w:lineRule="auto"/>
+        <w:rPr>
+          <w:sz w:val="28"/>
+          <w:szCs w:val="28"/>
+          <w:u w:val="single"/>
+        </w:rPr>
+      </w:pPr>
+      <w:r>
+        <w:rPr>
+          <w:rtl w:val="0"/>
+        </w:rPr>
+      </w:r>
+    </w:p>
+    <w:p>
+      <w:pPr>
+        <w:spacing w:after="80" w:before="60" w:lineRule="auto"/>
+        <w:rPr>
+          <w:sz w:val="28"/>
+          <w:szCs w:val="28"/>
+          <w:u w:val="single"/>
+        </w:rPr>
+      </w:pPr>
+      <w:r>
+        <w:rPr>
+          <w:sz w:val="28"/>
+          <w:szCs w:val="28"/>
+          <w:u w:val="single"/>
+        </w:rPr>
+        <w:drawing>
+          <wp:anchor allowOverlap="1" behindDoc="0" distB="114300" distT="114300" distL="114300" distR="114300" hidden="0" layoutInCell="1" locked="0" relativeHeight="0" simplePos="0">
+            <wp:simplePos x="0" y="0"/>
+            <wp:positionH relativeFrom="margin">
+              <wp:posOffset>-728662</wp:posOffset>
+            </wp:positionH>
+            <wp:positionV relativeFrom="margin">
+              <wp:posOffset>4143375</wp:posOffset>
+            </wp:positionV>
+            <wp:extent cx="7400925" cy="3171825"/>
+            <wp:effectExtent b="0" l="0" r="0" t="0"/>
+            <wp:wrapNone/>
+            <wp:docPr id="3" name="image4.png"/>
+            <a:graphic>
+              <a:graphicData uri="http://schemas.openxmlformats.org/drawingml/2006/picture">
+                <pic:pic>
+                  <pic:nvPicPr>
+                    <pic:cNvPr id="0" name="image4.png"/>
+                    <pic:cNvPicPr preferRelativeResize="0"/>
+                  </pic:nvPicPr>
+                  <pic:blipFill>
+                    <a:blip r:embed="rId9"/>
+                    <a:srcRect b="0" l="0" r="0" t="0"/>
+                    <a:stretch>
+                      <a:fillRect/>
+                    </a:stretch>
+                  </pic:blipFill>
+                  <pic:spPr>
+                    <a:xfrm>
+                      <a:off x="0" y="0"/>
+                      <a:ext cx="7400925" cy="3171825"/>
+                    </a:xfrm>
+                    <a:prstGeom prst="rect"/>
+                    <a:ln/>
+                  </pic:spPr>
+                </pic:pic>
+              </a:graphicData>
+            </a:graphic>
+          </wp:anchor>
+        </w:drawing>
+      </w:r>
+      <w:r>
+        <w:rPr>
+          <w:rtl w:val="0"/>
+        </w:rPr>
+      </w:r>
+    </w:p>
+    <w:p>
+      <w:pPr>
+        <w:spacing w:after="80" w:before="60" w:lineRule="auto"/>
+        <w:rPr>
+          <w:sz w:val="28"/>
+          <w:szCs w:val="28"/>
+          <w:u w:val="single"/>
+        </w:rPr>
+      </w:pPr>
+      <w:r>
+        <w:rPr>
+          <w:rtl w:val="0"/>
+        </w:rPr>
+      </w:r>
+    </w:p>
+    <w:p>
+      <w:pPr>
+        <w:spacing w:after="80" w:before="60" w:lineRule="auto"/>
+        <w:rPr>
+          <w:sz w:val="28"/>
+          <w:szCs w:val="28"/>
+          <w:u w:val="single"/>
+        </w:rPr>
+      </w:pPr>
+      <w:r>
+        <w:rPr>
+          <w:rtl w:val="0"/>
+        </w:rPr>
+      </w:r>
+    </w:p>
+    <w:p>
+      <w:pPr>
+        <w:spacing w:after="80" w:before="60" w:lineRule="auto"/>
+        <w:rPr>
+          <w:sz w:val="28"/>
+          <w:szCs w:val="28"/>
+          <w:u w:val="single"/>
+        </w:rPr>
+      </w:pPr>
+      <w:r>
+        <w:rPr>
+          <w:rtl w:val="0"/>
+        </w:rPr>
+      </w:r>
+    </w:p>
+    <w:p>
+      <w:pPr>
+        <w:spacing w:after="80" w:before="60" w:lineRule="auto"/>
+        <w:rPr>
+          <w:sz w:val="28"/>
+          <w:szCs w:val="28"/>
+          <w:u w:val="single"/>
+        </w:rPr>
+      </w:pPr>
+      <w:r>
+        <w:rPr>
+          <w:rtl w:val="0"/>
+        </w:rPr>
+      </w:r>
+    </w:p>
+    <w:p>
+      <w:pPr>
+        <w:spacing w:after="80" w:before="60" w:lineRule="auto"/>
+        <w:rPr>
+          <w:sz w:val="28"/>
+          <w:szCs w:val="28"/>
+          <w:u w:val="single"/>
+        </w:rPr>
+      </w:pPr>
+      <w:r>
+        <w:rPr>
+          <w:rtl w:val="0"/>
+        </w:rPr>
+      </w:r>
+    </w:p>
+    <w:p>
+      <w:pPr>
+        <w:spacing w:after="80" w:before="60" w:lineRule="auto"/>
+        <w:rPr>
+          <w:sz w:val="28"/>
+          <w:szCs w:val="28"/>
+          <w:u w:val="single"/>
+        </w:rPr>
+      </w:pPr>
+      <w:r>
+        <w:rPr>
+          <w:rtl w:val="0"/>
+        </w:rPr>
+      </w:r>
+    </w:p>
+    <w:p>
+      <w:pPr>
+        <w:spacing w:after="80" w:before="60" w:lineRule="auto"/>
+        <w:rPr>
+          <w:sz w:val="28"/>
+          <w:szCs w:val="28"/>
+          <w:u w:val="single"/>
+        </w:rPr>
+      </w:pPr>
+      <w:r>
+        <w:rPr>
+          <w:rtl w:val="0"/>
+        </w:rPr>
+      </w:r>
+    </w:p>
+    <w:p>
+      <w:pPr>
+        <w:spacing w:after="80" w:before="60" w:lineRule="auto"/>
+        <w:rPr>
+          <w:sz w:val="28"/>
+          <w:szCs w:val="28"/>
+          <w:u w:val="single"/>
+        </w:rPr>
+      </w:pPr>
+      <w:r>
+        <w:rPr>
+          <w:rtl w:val="0"/>
+        </w:rPr>
+      </w:r>
+    </w:p>
+    <w:p>
+      <w:pPr>
+        <w:spacing w:after="80" w:before="60" w:lineRule="auto"/>
+        <w:rPr>
+          <w:sz w:val="28"/>
+          <w:szCs w:val="28"/>
+          <w:u w:val="single"/>
+        </w:rPr>
+      </w:pPr>
+      <w:r>
+        <w:rPr>
+          <w:rtl w:val="0"/>
+        </w:rPr>
+      </w:r>
+    </w:p>
+    <w:p>
+      <w:pPr>
+        <w:spacing w:after="80" w:before="60" w:lineRule="auto"/>
+        <w:rPr>
+          <w:sz w:val="28"/>
+          <w:szCs w:val="28"/>
+          <w:u w:val="single"/>
+        </w:rPr>
+      </w:pPr>
+      <w:r>
+        <w:rPr>
+          <w:rtl w:val="0"/>
+        </w:rPr>
+      </w:r>
+    </w:p>
+    <w:p>
+      <w:pPr>
+        <w:spacing w:after="80" w:before="60" w:lineRule="auto"/>
+        <w:rPr>
+          <w:sz w:val="28"/>
+          <w:szCs w:val="28"/>
+          <w:u w:val="single"/>
+        </w:rPr>
+      </w:pPr>
+      <w:r>
+        <w:rPr>
+          <w:rtl w:val="0"/>
+        </w:rPr>
+      </w:r>
+    </w:p>
+    <w:p>
+      <w:pPr>
+        <w:spacing w:after="80" w:before="60" w:lineRule="auto"/>
+        <w:rPr>
+          <w:sz w:val="28"/>
+          <w:szCs w:val="28"/>
+          <w:u w:val="single"/>
+        </w:rPr>
+      </w:pPr>
+      <w:r>
+        <w:rPr>
+          <w:rtl w:val="0"/>
+        </w:rPr>
       </w:r>
     </w:p>
     <w:p>
@@ -5571,6 +6927,446 @@
         <w:ind w:left="720" w:hanging="360"/>
       </w:pPr>
       <w:rPr>
+        <w:u w:val="none"/>
+      </w:rPr>
+    </w:lvl>
+    <w:lvl w:ilvl="1">
+      <w:start w:val="1"/>
+      <w:numFmt w:val="bullet"/>
+      <w:lvlText w:val="○"/>
+      <w:lvlJc w:val="left"/>
+      <w:pPr>
+        <w:ind w:left="1440" w:hanging="360"/>
+      </w:pPr>
+      <w:rPr>
+        <w:u w:val="none"/>
+      </w:rPr>
+    </w:lvl>
+    <w:lvl w:ilvl="2">
+      <w:start w:val="1"/>
+      <w:numFmt w:val="bullet"/>
+      <w:lvlText w:val="■"/>
+      <w:lvlJc w:val="left"/>
+      <w:pPr>
+        <w:ind w:left="2160" w:hanging="360"/>
+      </w:pPr>
+      <w:rPr>
+        <w:u w:val="none"/>
+      </w:rPr>
+    </w:lvl>
+    <w:lvl w:ilvl="3">
+      <w:start w:val="1"/>
+      <w:numFmt w:val="bullet"/>
+      <w:lvlText w:val="●"/>
+      <w:lvlJc w:val="left"/>
+      <w:pPr>
+        <w:ind w:left="2880" w:hanging="360"/>
+      </w:pPr>
+      <w:rPr>
+        <w:u w:val="none"/>
+      </w:rPr>
+    </w:lvl>
+    <w:lvl w:ilvl="4">
+      <w:start w:val="1"/>
+      <w:numFmt w:val="bullet"/>
+      <w:lvlText w:val="○"/>
+      <w:lvlJc w:val="left"/>
+      <w:pPr>
+        <w:ind w:left="3600" w:hanging="360"/>
+      </w:pPr>
+      <w:rPr>
+        <w:u w:val="none"/>
+      </w:rPr>
+    </w:lvl>
+    <w:lvl w:ilvl="5">
+      <w:start w:val="1"/>
+      <w:numFmt w:val="bullet"/>
+      <w:lvlText w:val="■"/>
+      <w:lvlJc w:val="left"/>
+      <w:pPr>
+        <w:ind w:left="4320" w:hanging="360"/>
+      </w:pPr>
+      <w:rPr>
+        <w:u w:val="none"/>
+      </w:rPr>
+    </w:lvl>
+    <w:lvl w:ilvl="6">
+      <w:start w:val="1"/>
+      <w:numFmt w:val="bullet"/>
+      <w:lvlText w:val="●"/>
+      <w:lvlJc w:val="left"/>
+      <w:pPr>
+        <w:ind w:left="5040" w:hanging="360"/>
+      </w:pPr>
+      <w:rPr>
+        <w:u w:val="none"/>
+      </w:rPr>
+    </w:lvl>
+    <w:lvl w:ilvl="7">
+      <w:start w:val="1"/>
+      <w:numFmt w:val="bullet"/>
+      <w:lvlText w:val="○"/>
+      <w:lvlJc w:val="left"/>
+      <w:pPr>
+        <w:ind w:left="5760" w:hanging="360"/>
+      </w:pPr>
+      <w:rPr>
+        <w:u w:val="none"/>
+      </w:rPr>
+    </w:lvl>
+    <w:lvl w:ilvl="8">
+      <w:start w:val="1"/>
+      <w:numFmt w:val="bullet"/>
+      <w:lvlText w:val="■"/>
+      <w:lvlJc w:val="left"/>
+      <w:pPr>
+        <w:ind w:left="6480" w:hanging="360"/>
+      </w:pPr>
+      <w:rPr>
+        <w:u w:val="none"/>
+      </w:rPr>
+    </w:lvl>
+  </w:abstractNum>
+  <w:abstractNum w:abstractNumId="5">
+    <w:lvl w:ilvl="0">
+      <w:start w:val="1"/>
+      <w:numFmt w:val="bullet"/>
+      <w:lvlText w:val="●"/>
+      <w:lvlJc w:val="left"/>
+      <w:pPr>
+        <w:ind w:left="720" w:hanging="360"/>
+      </w:pPr>
+      <w:rPr>
+        <w:u w:val="none"/>
+      </w:rPr>
+    </w:lvl>
+    <w:lvl w:ilvl="1">
+      <w:start w:val="1"/>
+      <w:numFmt w:val="bullet"/>
+      <w:lvlText w:val="○"/>
+      <w:lvlJc w:val="left"/>
+      <w:pPr>
+        <w:ind w:left="1440" w:hanging="360"/>
+      </w:pPr>
+      <w:rPr>
+        <w:u w:val="none"/>
+      </w:rPr>
+    </w:lvl>
+    <w:lvl w:ilvl="2">
+      <w:start w:val="1"/>
+      <w:numFmt w:val="bullet"/>
+      <w:lvlText w:val="■"/>
+      <w:lvlJc w:val="left"/>
+      <w:pPr>
+        <w:ind w:left="2160" w:hanging="360"/>
+      </w:pPr>
+      <w:rPr>
+        <w:u w:val="none"/>
+      </w:rPr>
+    </w:lvl>
+    <w:lvl w:ilvl="3">
+      <w:start w:val="1"/>
+      <w:numFmt w:val="bullet"/>
+      <w:lvlText w:val="●"/>
+      <w:lvlJc w:val="left"/>
+      <w:pPr>
+        <w:ind w:left="2880" w:hanging="360"/>
+      </w:pPr>
+      <w:rPr>
+        <w:u w:val="none"/>
+      </w:rPr>
+    </w:lvl>
+    <w:lvl w:ilvl="4">
+      <w:start w:val="1"/>
+      <w:numFmt w:val="bullet"/>
+      <w:lvlText w:val="○"/>
+      <w:lvlJc w:val="left"/>
+      <w:pPr>
+        <w:ind w:left="3600" w:hanging="360"/>
+      </w:pPr>
+      <w:rPr>
+        <w:u w:val="none"/>
+      </w:rPr>
+    </w:lvl>
+    <w:lvl w:ilvl="5">
+      <w:start w:val="1"/>
+      <w:numFmt w:val="bullet"/>
+      <w:lvlText w:val="■"/>
+      <w:lvlJc w:val="left"/>
+      <w:pPr>
+        <w:ind w:left="4320" w:hanging="360"/>
+      </w:pPr>
+      <w:rPr>
+        <w:u w:val="none"/>
+      </w:rPr>
+    </w:lvl>
+    <w:lvl w:ilvl="6">
+      <w:start w:val="1"/>
+      <w:numFmt w:val="bullet"/>
+      <w:lvlText w:val="●"/>
+      <w:lvlJc w:val="left"/>
+      <w:pPr>
+        <w:ind w:left="5040" w:hanging="360"/>
+      </w:pPr>
+      <w:rPr>
+        <w:u w:val="none"/>
+      </w:rPr>
+    </w:lvl>
+    <w:lvl w:ilvl="7">
+      <w:start w:val="1"/>
+      <w:numFmt w:val="bullet"/>
+      <w:lvlText w:val="○"/>
+      <w:lvlJc w:val="left"/>
+      <w:pPr>
+        <w:ind w:left="5760" w:hanging="360"/>
+      </w:pPr>
+      <w:rPr>
+        <w:u w:val="none"/>
+      </w:rPr>
+    </w:lvl>
+    <w:lvl w:ilvl="8">
+      <w:start w:val="1"/>
+      <w:numFmt w:val="bullet"/>
+      <w:lvlText w:val="■"/>
+      <w:lvlJc w:val="left"/>
+      <w:pPr>
+        <w:ind w:left="6480" w:hanging="360"/>
+      </w:pPr>
+      <w:rPr>
+        <w:u w:val="none"/>
+      </w:rPr>
+    </w:lvl>
+  </w:abstractNum>
+  <w:abstractNum w:abstractNumId="6">
+    <w:lvl w:ilvl="0">
+      <w:start w:val="1"/>
+      <w:numFmt w:val="bullet"/>
+      <w:lvlText w:val="●"/>
+      <w:lvlJc w:val="left"/>
+      <w:pPr>
+        <w:ind w:left="720" w:hanging="360"/>
+      </w:pPr>
+      <w:rPr>
+        <w:u w:val="none"/>
+      </w:rPr>
+    </w:lvl>
+    <w:lvl w:ilvl="1">
+      <w:start w:val="1"/>
+      <w:numFmt w:val="bullet"/>
+      <w:lvlText w:val="○"/>
+      <w:lvlJc w:val="left"/>
+      <w:pPr>
+        <w:ind w:left="1440" w:hanging="360"/>
+      </w:pPr>
+      <w:rPr>
+        <w:u w:val="none"/>
+      </w:rPr>
+    </w:lvl>
+    <w:lvl w:ilvl="2">
+      <w:start w:val="1"/>
+      <w:numFmt w:val="bullet"/>
+      <w:lvlText w:val="■"/>
+      <w:lvlJc w:val="left"/>
+      <w:pPr>
+        <w:ind w:left="2160" w:hanging="360"/>
+      </w:pPr>
+      <w:rPr>
+        <w:u w:val="none"/>
+      </w:rPr>
+    </w:lvl>
+    <w:lvl w:ilvl="3">
+      <w:start w:val="1"/>
+      <w:numFmt w:val="bullet"/>
+      <w:lvlText w:val="●"/>
+      <w:lvlJc w:val="left"/>
+      <w:pPr>
+        <w:ind w:left="2880" w:hanging="360"/>
+      </w:pPr>
+      <w:rPr>
+        <w:u w:val="none"/>
+      </w:rPr>
+    </w:lvl>
+    <w:lvl w:ilvl="4">
+      <w:start w:val="1"/>
+      <w:numFmt w:val="bullet"/>
+      <w:lvlText w:val="○"/>
+      <w:lvlJc w:val="left"/>
+      <w:pPr>
+        <w:ind w:left="3600" w:hanging="360"/>
+      </w:pPr>
+      <w:rPr>
+        <w:u w:val="none"/>
+      </w:rPr>
+    </w:lvl>
+    <w:lvl w:ilvl="5">
+      <w:start w:val="1"/>
+      <w:numFmt w:val="bullet"/>
+      <w:lvlText w:val="■"/>
+      <w:lvlJc w:val="left"/>
+      <w:pPr>
+        <w:ind w:left="4320" w:hanging="360"/>
+      </w:pPr>
+      <w:rPr>
+        <w:u w:val="none"/>
+      </w:rPr>
+    </w:lvl>
+    <w:lvl w:ilvl="6">
+      <w:start w:val="1"/>
+      <w:numFmt w:val="bullet"/>
+      <w:lvlText w:val="●"/>
+      <w:lvlJc w:val="left"/>
+      <w:pPr>
+        <w:ind w:left="5040" w:hanging="360"/>
+      </w:pPr>
+      <w:rPr>
+        <w:u w:val="none"/>
+      </w:rPr>
+    </w:lvl>
+    <w:lvl w:ilvl="7">
+      <w:start w:val="1"/>
+      <w:numFmt w:val="bullet"/>
+      <w:lvlText w:val="○"/>
+      <w:lvlJc w:val="left"/>
+      <w:pPr>
+        <w:ind w:left="5760" w:hanging="360"/>
+      </w:pPr>
+      <w:rPr>
+        <w:u w:val="none"/>
+      </w:rPr>
+    </w:lvl>
+    <w:lvl w:ilvl="8">
+      <w:start w:val="1"/>
+      <w:numFmt w:val="bullet"/>
+      <w:lvlText w:val="■"/>
+      <w:lvlJc w:val="left"/>
+      <w:pPr>
+        <w:ind w:left="6480" w:hanging="360"/>
+      </w:pPr>
+      <w:rPr>
+        <w:u w:val="none"/>
+      </w:rPr>
+    </w:lvl>
+  </w:abstractNum>
+  <w:abstractNum w:abstractNumId="7">
+    <w:lvl w:ilvl="0">
+      <w:start w:val="1"/>
+      <w:numFmt w:val="bullet"/>
+      <w:lvlText w:val="●"/>
+      <w:lvlJc w:val="left"/>
+      <w:pPr>
+        <w:ind w:left="720" w:hanging="360"/>
+      </w:pPr>
+      <w:rPr>
+        <w:u w:val="none"/>
+      </w:rPr>
+    </w:lvl>
+    <w:lvl w:ilvl="1">
+      <w:start w:val="1"/>
+      <w:numFmt w:val="bullet"/>
+      <w:lvlText w:val="○"/>
+      <w:lvlJc w:val="left"/>
+      <w:pPr>
+        <w:ind w:left="1440" w:hanging="360"/>
+      </w:pPr>
+      <w:rPr>
+        <w:u w:val="none"/>
+      </w:rPr>
+    </w:lvl>
+    <w:lvl w:ilvl="2">
+      <w:start w:val="1"/>
+      <w:numFmt w:val="bullet"/>
+      <w:lvlText w:val="■"/>
+      <w:lvlJc w:val="left"/>
+      <w:pPr>
+        <w:ind w:left="2160" w:hanging="360"/>
+      </w:pPr>
+      <w:rPr>
+        <w:u w:val="none"/>
+      </w:rPr>
+    </w:lvl>
+    <w:lvl w:ilvl="3">
+      <w:start w:val="1"/>
+      <w:numFmt w:val="bullet"/>
+      <w:lvlText w:val="●"/>
+      <w:lvlJc w:val="left"/>
+      <w:pPr>
+        <w:ind w:left="2880" w:hanging="360"/>
+      </w:pPr>
+      <w:rPr>
+        <w:u w:val="none"/>
+      </w:rPr>
+    </w:lvl>
+    <w:lvl w:ilvl="4">
+      <w:start w:val="1"/>
+      <w:numFmt w:val="bullet"/>
+      <w:lvlText w:val="○"/>
+      <w:lvlJc w:val="left"/>
+      <w:pPr>
+        <w:ind w:left="3600" w:hanging="360"/>
+      </w:pPr>
+      <w:rPr>
+        <w:u w:val="none"/>
+      </w:rPr>
+    </w:lvl>
+    <w:lvl w:ilvl="5">
+      <w:start w:val="1"/>
+      <w:numFmt w:val="bullet"/>
+      <w:lvlText w:val="■"/>
+      <w:lvlJc w:val="left"/>
+      <w:pPr>
+        <w:ind w:left="4320" w:hanging="360"/>
+      </w:pPr>
+      <w:rPr>
+        <w:u w:val="none"/>
+      </w:rPr>
+    </w:lvl>
+    <w:lvl w:ilvl="6">
+      <w:start w:val="1"/>
+      <w:numFmt w:val="bullet"/>
+      <w:lvlText w:val="●"/>
+      <w:lvlJc w:val="left"/>
+      <w:pPr>
+        <w:ind w:left="5040" w:hanging="360"/>
+      </w:pPr>
+      <w:rPr>
+        <w:u w:val="none"/>
+      </w:rPr>
+    </w:lvl>
+    <w:lvl w:ilvl="7">
+      <w:start w:val="1"/>
+      <w:numFmt w:val="bullet"/>
+      <w:lvlText w:val="○"/>
+      <w:lvlJc w:val="left"/>
+      <w:pPr>
+        <w:ind w:left="5760" w:hanging="360"/>
+      </w:pPr>
+      <w:rPr>
+        <w:u w:val="none"/>
+      </w:rPr>
+    </w:lvl>
+    <w:lvl w:ilvl="8">
+      <w:start w:val="1"/>
+      <w:numFmt w:val="bullet"/>
+      <w:lvlText w:val="■"/>
+      <w:lvlJc w:val="left"/>
+      <w:pPr>
+        <w:ind w:left="6480" w:hanging="360"/>
+      </w:pPr>
+      <w:rPr>
+        <w:u w:val="none"/>
+      </w:rPr>
+    </w:lvl>
+  </w:abstractNum>
+  <w:abstractNum w:abstractNumId="8">
+    <w:lvl w:ilvl="0">
+      <w:start w:val="1"/>
+      <w:numFmt w:val="bullet"/>
+      <w:lvlText w:val="●"/>
+      <w:lvlJc w:val="left"/>
+      <w:pPr>
+        <w:ind w:left="720" w:hanging="360"/>
+      </w:pPr>
+      <w:rPr>
         <w:sz w:val="24"/>
         <w:szCs w:val="24"/>
         <w:u w:val="none"/>
@@ -5673,7 +7469,117 @@
       </w:rPr>
     </w:lvl>
   </w:abstractNum>
-  <w:abstractNum w:abstractNumId="5">
+  <w:abstractNum w:abstractNumId="9">
+    <w:lvl w:ilvl="0">
+      <w:start w:val="1"/>
+      <w:numFmt w:val="bullet"/>
+      <w:lvlText w:val="●"/>
+      <w:lvlJc w:val="left"/>
+      <w:pPr>
+        <w:ind w:left="720" w:hanging="360"/>
+      </w:pPr>
+      <w:rPr>
+        <w:u w:val="none"/>
+      </w:rPr>
+    </w:lvl>
+    <w:lvl w:ilvl="1">
+      <w:start w:val="1"/>
+      <w:numFmt w:val="bullet"/>
+      <w:lvlText w:val="○"/>
+      <w:lvlJc w:val="left"/>
+      <w:pPr>
+        <w:ind w:left="1440" w:hanging="360"/>
+      </w:pPr>
+      <w:rPr>
+        <w:u w:val="none"/>
+      </w:rPr>
+    </w:lvl>
+    <w:lvl w:ilvl="2">
+      <w:start w:val="1"/>
+      <w:numFmt w:val="bullet"/>
+      <w:lvlText w:val="■"/>
+      <w:lvlJc w:val="left"/>
+      <w:pPr>
+        <w:ind w:left="2160" w:hanging="360"/>
+      </w:pPr>
+      <w:rPr>
+        <w:u w:val="none"/>
+      </w:rPr>
+    </w:lvl>
+    <w:lvl w:ilvl="3">
+      <w:start w:val="1"/>
+      <w:numFmt w:val="bullet"/>
+      <w:lvlText w:val="●"/>
+      <w:lvlJc w:val="left"/>
+      <w:pPr>
+        <w:ind w:left="2880" w:hanging="360"/>
+      </w:pPr>
+      <w:rPr>
+        <w:u w:val="none"/>
+      </w:rPr>
+    </w:lvl>
+    <w:lvl w:ilvl="4">
+      <w:start w:val="1"/>
+      <w:numFmt w:val="bullet"/>
+      <w:lvlText w:val="○"/>
+      <w:lvlJc w:val="left"/>
+      <w:pPr>
+        <w:ind w:left="3600" w:hanging="360"/>
+      </w:pPr>
+      <w:rPr>
+        <w:u w:val="none"/>
+      </w:rPr>
+    </w:lvl>
+    <w:lvl w:ilvl="5">
+      <w:start w:val="1"/>
+      <w:numFmt w:val="bullet"/>
+      <w:lvlText w:val="■"/>
+      <w:lvlJc w:val="left"/>
+      <w:pPr>
+        <w:ind w:left="4320" w:hanging="360"/>
+      </w:pPr>
+      <w:rPr>
+        <w:u w:val="none"/>
+      </w:rPr>
+    </w:lvl>
+    <w:lvl w:ilvl="6">
+      <w:start w:val="1"/>
+      <w:numFmt w:val="bullet"/>
+      <w:lvlText w:val="●"/>
+      <w:lvlJc w:val="left"/>
+      <w:pPr>
+        <w:ind w:left="5040" w:hanging="360"/>
+      </w:pPr>
+      <w:rPr>
+        <w:u w:val="none"/>
+      </w:rPr>
+    </w:lvl>
+    <w:lvl w:ilvl="7">
+      <w:start w:val="1"/>
+      <w:numFmt w:val="bullet"/>
+      <w:lvlText w:val="○"/>
+      <w:lvlJc w:val="left"/>
+      <w:pPr>
+        <w:ind w:left="5760" w:hanging="360"/>
+      </w:pPr>
+      <w:rPr>
+        <w:u w:val="none"/>
+      </w:rPr>
+    </w:lvl>
+    <w:lvl w:ilvl="8">
+      <w:start w:val="1"/>
+      <w:numFmt w:val="bullet"/>
+      <w:lvlText w:val="■"/>
+      <w:lvlJc w:val="left"/>
+      <w:pPr>
+        <w:ind w:left="6480" w:hanging="360"/>
+      </w:pPr>
+      <w:rPr>
+        <w:u w:val="none"/>
+      </w:rPr>
+    </w:lvl>
+  </w:abstractNum>
+  <w:abstractNum w:abstractNumId="10">
     <w:lvl w:ilvl="0">
       <w:start w:val="1"/>
       <w:numFmt w:val="bullet"/>
@@ -5797,6 +7703,21 @@
   </w:num>
   <w:num w:numId="5">
     <w:abstractNumId w:val="5"/>
+  </w:num>
+  <w:num w:numId="6">
+    <w:abstractNumId w:val="6"/>
+  </w:num>
+  <w:num w:numId="7">
+    <w:abstractNumId w:val="7"/>
+  </w:num>
+  <w:num w:numId="8">
+    <w:abstractNumId w:val="8"/>
+  </w:num>
+  <w:num w:numId="9">
+    <w:abstractNumId w:val="9"/>
+  </w:num>
+  <w:num w:numId="10">
+    <w:abstractNumId w:val="10"/>
   </w:num>
 </w:numbering>
 </file>

</xml_diff>